<commit_message>
Fix §2.5→§2.4 cross-refs and harmonize §4 company terminology
- Update dangling 'раздел 2.5' references in §1 and §2.9 to §2.4
  (investment-protection section was renumbered to 2.4)
- §4: 'Закупочную и продающую' -> 'Производственную и продающую'
  to match PrincipalCo/SalesCo labels used in §1 and §3

https://claude.ai/code/session_01JTbBsiSWXRS1fuAGFXnjiU
</commit_message>
<xml_diff>
--- a/STRIKER_Investment_Memorandum_RU_v2.docx
+++ b/STRIKER_Investment_Memorandum_RU_v2.docx
@@ -10547,7 +10547,7 @@
           <w:color w:val="0a0a0a"/>
           <w:rtl w:val="0"/>
         </w:rPr>
-        <w:t xml:space="preserve"> Британский холдинг пользуется действующим договором о защите инвестиций с Болгарией (1995, в силе с 1997) и Чехией (1990): гарантии от экспроприации, свободный перевод доходов и прямой доступ к международному арбитражу против государства (исполнимо в 170+ странах). У Люксембурга такой защиты нет (раздел 2.5).</w:t>
+        <w:t xml:space="preserve"> Британский холдинг пользуется действующим договором о защите инвестиций с Болгарией (1995, в силе с 1997) и Чехией (1990): гарантии от экспроприации, свободный перевод доходов и прямой доступ к международному арбитражу против государства (исполнимо в 170+ странах). У Люксембурга такой защиты нет (раздел 2.4).</w:t>
       </w:r>
     </w:p>
     <w:p>
@@ -19783,7 +19783,7 @@
           <w:color w:val="0a0a0a"/>
           <w:rtl w:val="0"/>
         </w:rPr>
-        <w:t xml:space="preserve">Реальный риск находится в Болгарии, и против неё у британского холдинга есть действующий договор о защите инвестиций с доступом к международному арбитражу; у люксембургского холдинга такой защиты в отношении стран ЕС нет (раздел 2.5).</w:t>
+        <w:t>Реальный риск находится в Болгарии, и против неё у британского холдинга есть действующий договор о защите инвестиций с доступом к международному арбитражу; у люксембургского холдинга такой защиты в отношении стран ЕС нет (раздел 2.4).</w:t>
       </w:r>
     </w:p>
     <w:p>
@@ -22801,7 +22801,7 @@
           <w:szCs w:val="21"/>
           <w:rtl w:val="0"/>
         </w:rPr>
-        <w:t xml:space="preserve">Продающую компанию рекомендуется разместить в Болгарии — там же, где операционную: одна из самых низких ставок, полноценный военно-экспортный режим, передача прибыли без потерь. Закупочную и продающую функции целесообразно разделить на две болгарские компании. Размещение лицензии в Болгарии не отменяет того, что при сборке и отгрузке из Чехии применяются чешские экспортные правила и согласие (раздел 7.6).</w:t>
+        <w:t>Продающую компанию рекомендуется разместить в Болгарии — там же, где операционную: одна из самых низких ставок, полноценный военно-экспортный режим, передача прибыли без потерь. Производственную и продающую функции целесообразно разделить на две болгарские компании. Размещение лицензии в Болгарии не отменяет того, что при сборке и отгрузке из Чехии применяются чешские экспортные правила и согласие (раздел 7.6).</w:t>
       </w:r>
       <w:r>
         <w:rPr>

</xml_diff>

<commit_message>
Renumber §2: close 2.4->2.6 gap (cascade 2.6-2.9 -> 2.5-2.8)
Make §2 numbering continuous after protection section became 2.4:
- Headings 2.6/2.7/2.8/2.9 -> 2.5/2.6/2.7/2.8
- Update cross-refs accordingly (§2.9->§2.8, раздел 2.6->2.5, 2.7->2.6)

https://claude.ai/code/session_01JTbBsiSWXRS1fuAGFXnjiU
</commit_message>
<xml_diff>
--- a/STRIKER_Investment_Memorandum_RU_v2.docx
+++ b/STRIKER_Investment_Memorandum_RU_v2.docx
@@ -12907,7 +12907,7 @@
           <w:szCs w:val="22"/>
           <w:rtl w:val="0"/>
         </w:rPr>
-        <w:t xml:space="preserve">2.6 Стоимость содержания холдинга (реальное присутствие)</w:t>
+        <w:t>2.5 Стоимость содержания холдинга (реальное присутствие)</w:t>
       </w:r>
       <w:r>
         <w:rPr>
@@ -14883,7 +14883,7 @@
           <w:szCs w:val="22"/>
           <w:rtl w:val="0"/>
         </w:rPr>
-        <w:t xml:space="preserve">2.7 Налогообложение при выходе из проекта</w:t>
+        <w:t>2.6 Налогообложение при выходе из проекта</w:t>
       </w:r>
       <w:r>
         <w:rPr>
@@ -17355,7 +17355,7 @@
           <w:color w:val="0a0a0a"/>
           <w:rtl w:val="0"/>
         </w:rPr>
-        <w:t xml:space="preserve">Освобождение прироста на уровне структуры дают все четыре юрисдикции. Для нашего проекта (торговая группа, доли 100%, международные инвесторы) критерий выхода работает в пользу Великобритании и Ирландии, что согласуется с итоговой рекомендацией (§2.9).</w:t>
+        <w:t>Освобождение прироста на уровне структуры дают все четыре юрисдикции. Для нашего проекта (торговая группа, доли 100%, международные инвесторы) критерий выхода работает в пользу Великобритании и Ирландии, что согласуется с итоговой рекомендацией (§2.8).</w:t>
       </w:r>
       <w:r>
         <w:rPr>
@@ -17445,7 +17445,7 @@
           <w:szCs w:val="22"/>
           <w:rtl w:val="0"/>
         </w:rPr>
-        <w:t xml:space="preserve">2.8 Великобритания и Люксембург: детальное сравнение</w:t>
+        <w:t>2.7 Великобритания и Люксембург: детальное сравнение</w:t>
       </w:r>
       <w:r>
         <w:rPr>
@@ -19618,7 +19618,7 @@
           <w:szCs w:val="22"/>
           <w:rtl w:val="0"/>
         </w:rPr>
-        <w:t xml:space="preserve">2.9 Рекомендация по юрисдикции холдинга</w:t>
+        <w:t>2.8 Рекомендация по юрисдикции холдинга</w:t>
       </w:r>
       <w:r>
         <w:rPr>
@@ -19819,7 +19819,7 @@
           <w:color w:val="0a0a0a"/>
           <w:rtl w:val="0"/>
         </w:rPr>
-        <w:t xml:space="preserve"> Один директор в Великобритании против совета с большинством местных резидентов и местного администрирования в Люксембурге (раздел 2.6).</w:t>
+        <w:t xml:space="preserve"> Один директор в Великобритании против совета с большинством местных резидентов и местного администрирования в Люксембурге (раздел 2.5).</w:t>
       </w:r>
     </w:p>
     <w:p>
@@ -19855,7 +19855,7 @@
           <w:color w:val="0a0a0a"/>
           <w:rtl w:val="0"/>
         </w:rPr>
-        <w:t xml:space="preserve"> На уровне структуры освобождение дают обе юрисдикции, но на уровне инвестора британский холдинг чище (раздел 2.7).</w:t>
+        <w:t xml:space="preserve"> На уровне структуры освобождение дают обе юрисдикции, но на уровне инвестора британский холдинг чище (раздел 2.6).</w:t>
       </w:r>
     </w:p>
     <w:p>

</xml_diff>

<commit_message>
Redraw control-split as three-tier ownership chart
Show full chain: investors (economic vs voting share classes) -> UK
holding (where the share-class split sits) -> both Bulgarian companies
(PrincipalCo and SalesCo), with cleared board + golden share at the
Bulgarian level. Clarifies that control (voting in holding, management in
Bulgaria) rests with NATO/EU persons while profit flows up to all
investors, and that the safeguard covers both companies, not only SalesCo.

https://claude.ai/code/session_01JTbBsiSWXRS1fuAGFXnjiU
</commit_message>
<xml_diff>
--- a/STRIKER_Investment_Memorandum_RU_v2.docx
+++ b/STRIKER_Investment_Memorandum_RU_v2.docx
@@ -24701,7 +24701,7 @@
         <w:rPr/>
         <w:drawing>
           <wp:inline distB="0" distT="0" distL="114300" distR="114300">
-            <wp:extent cx="6048000" cy="1568756"/>
+            <wp:extent cx="6048000" cy="3229221"/>
             <wp:effectExtent b="0" l="0" r="0" t="0"/>
             <wp:docPr id="8" name="image4.png"/>
             <a:graphic>
@@ -24721,7 +24721,7 @@
                   <pic:spPr>
                     <a:xfrm>
                       <a:off x="0" y="0"/>
-                      <a:ext cx="6048000" cy="1568756"/>
+                      <a:ext cx="6048000" cy="3229221"/>
                     </a:xfrm>
                     <a:prstGeom prst="rect"/>
                     <a:ln/>

</xml_diff>

<commit_message>
Rework §7.5 to two-level control split; verified against sources
Split the economic/control separation into its correct levels: share
classes + veto at the UK holding (mixed investor base); cleared board +
security agreement at the 100%-held Bulgarian companies (no third-party
golden share where there is a single shareholder). Update résumé and §1
cross-refs from singular 'licensee' to 'the Bulgarian project companies'.
Mechanism verified against US FOCI (32 CFR 117.11), EU Reg 2019/452,
Mubadala/Piaggio and EDGE/Milrem precedents, UK golden shares.

https://claude.ai/code/session_01JTbBsiSWXRS1fuAGFXnjiU
</commit_message>
<xml_diff>
--- a/STRIKER_Investment_Memorandum_RU_v2.docx
+++ b/STRIKER_Investment_Memorandum_RU_v2.docx
@@ -2143,7 +2143,7 @@
           <w:vertAlign w:val="baseline"/>
           <w:rtl w:val="0"/>
         </w:rPr>
-        <w:t xml:space="preserve">Закрепление контроля над компанией-лицензиатом за лицами из стран НАТО и ЕС — стандартная отраслевая практика (разделы 7.5 и 9).</w:t>
+        <w:t>Закрепление контроля над болгарскими компаниями проекта за лицами из стран НАТО и ЕС — стандартная отраслевая практика (разделы 7.5 и 9).</w:t>
       </w:r>
       <w:r>
         <w:rPr>
@@ -10506,7 +10506,7 @@
           <w:color w:val="0a0a0a"/>
           <w:rtl w:val="0"/>
         </w:rPr>
-        <w:t xml:space="preserve">. Болгария и Чехия — члены НАТО и ЕС с полноценными режимами лицензирования; производственная сертификация на Principal Co; экспортная лицензия на SalesCo. Отдельно закрываются вопросы страны выдачи лицензии (раздел 7.6) и контроля над лицензиатом со стороны лиц НАТО/ЕС (раздел 7.5).</w:t>
+        <w:t>. Болгария и Чехия — члены НАТО и ЕС с полноценными режимами лицензирования; производственная сертификация на Principal Co; экспортная лицензия на SalesCo. Отдельно закрываются вопросы страны выдачи лицензии (раздел 7.6) и контроля над болгарскими компаниями со стороны лиц НАТО/ЕС (раздел 7.5).</w:t>
       </w:r>
     </w:p>
     <w:p>
@@ -24587,7 +24587,7 @@
           <w:vertAlign w:val="baseline"/>
           <w:rtl w:val="0"/>
         </w:rPr>
-        <w:t xml:space="preserve">Инвесторы вне НАТО получают экономическое участие, но не контроль; для этого вводятся акции с ограниченным правом голоса.</w:t>
+        <w:t>На уровне холдинга вводятся классы акций: инвесторы вне НАТО получают акции с экономическими правами, но без (или с ограниченным) правом голоса; голосующий контроль и право вето по ключевым решениям — у инициаторов и инвесторов из стран НАТО и ЕС.</w:t>
       </w:r>
       <w:r>
         <w:rPr>
@@ -24635,7 +24635,7 @@
           <w:vertAlign w:val="baseline"/>
           <w:rtl w:val="0"/>
         </w:rPr>
-        <w:t xml:space="preserve">Контроль над компанией-лицензиатом закрепляется за лицами из стран НАТО и ЕС: специальный класс акций, право вето, директора с допуском, соглашение о безопасности.</w:t>
+        <w:t>На уровне болгарских компаний проекта (производственной и продающей), которые на 100% принадлежат холдингу, отдельной акции у внешних лиц быть не может — контроль обеспечивается органами управления: совет директоров и ключевые управленцы — лица из стран НАТО и ЕС с допуском к гостайне; дополнительно — соглашение о безопасности и положения устава, ограничивающие доступ к чувствительной информации.</w:t>
       </w:r>
       <w:r>
         <w:rPr>
@@ -24753,7 +24753,7 @@
           <w:szCs w:val="16"/>
           <w:rtl w:val="0"/>
         </w:rPr>
-        <w:t xml:space="preserve">Разделение экономического участия и контроля: прибыль получают все инвесторы, а управление компанией-лицензиатом остаётся за лицами из стран НАТО и ЕС.</w:t>
+        <w:t>Разделение экономического участия и контроля: прибыль получают все инвесторы, а контроль закреплён за лицами из стран НАТО и ЕС — голосующими акциями и правом вето в холдинге и составом органов управления в болгарских компаниях.</w:t>
       </w:r>
       <w:r>
         <w:rPr>

</xml_diff>

<commit_message>
Control diagram: move flow labels clear of connector lines (no overlap)
https://claude.ai/code/session_01JTbBsiSWXRS1fuAGFXnjiU
</commit_message>
<xml_diff>
--- a/STRIKER_Investment_Memorandum_RU_v2.docx
+++ b/STRIKER_Investment_Memorandum_RU_v2.docx
@@ -24701,7 +24701,7 @@
         <w:rPr/>
         <w:drawing>
           <wp:inline distB="0" distT="0" distL="114300" distR="114300">
-            <wp:extent cx="6048000" cy="3229221"/>
+            <wp:extent cx="6048000" cy="3215316"/>
             <wp:effectExtent b="0" l="0" r="0" t="0"/>
             <wp:docPr id="8" name="image4.png"/>
             <a:graphic>
@@ -24721,7 +24721,7 @@
                   <pic:spPr>
                     <a:xfrm>
                       <a:off x="0" y="0"/>
-                      <a:ext cx="6048000" cy="3229221"/>
+                      <a:ext cx="6048000" cy="3215316"/>
                     </a:xfrm>
                     <a:prstGeom prst="rect"/>
                     <a:ln/>

</xml_diff>